<commit_message>
mise a jour de la documentation git
</commit_message>
<xml_diff>
--- a/Documentation/DOCUMENTATION SUPERCAR.docx
+++ b/Documentation/DOCUMENTATION SUPERCAR.docx
@@ -41,6 +41,46 @@
             <w:pPr>
               <w:jc w:val="center"/>
             </w:pPr>
+            <w:r>
+              <w:rPr>
+                <w:noProof/>
+              </w:rPr>
+              <w:drawing>
+                <wp:inline distT="0" distB="0" distL="0" distR="0" wp14:anchorId="42C50974" wp14:editId="5F99F1F7">
+                  <wp:extent cx="3057525" cy="2886075"/>
+                  <wp:effectExtent l="0" t="0" r="0" b="0"/>
+                  <wp:docPr id="1195019274" name="Image 1"/>
+                  <wp:cNvGraphicFramePr>
+                    <a:graphicFrameLocks xmlns:a="http://schemas.openxmlformats.org/drawingml/2006/main" noChangeAspect="1"/>
+                  </wp:cNvGraphicFramePr>
+                  <a:graphic xmlns:a="http://schemas.openxmlformats.org/drawingml/2006/main">
+                    <a:graphicData uri="http://schemas.openxmlformats.org/drawingml/2006/picture">
+                      <pic:pic xmlns:pic="http://schemas.openxmlformats.org/drawingml/2006/picture">
+                        <pic:nvPicPr>
+                          <pic:cNvPr id="1195019274" name=""/>
+                          <pic:cNvPicPr/>
+                        </pic:nvPicPr>
+                        <pic:blipFill>
+                          <a:blip r:embed="rId7"/>
+                          <a:stretch>
+                            <a:fillRect/>
+                          </a:stretch>
+                        </pic:blipFill>
+                        <pic:spPr>
+                          <a:xfrm>
+                            <a:off x="0" y="0"/>
+                            <a:ext cx="3057525" cy="2886075"/>
+                          </a:xfrm>
+                          <a:prstGeom prst="rect">
+                            <a:avLst/>
+                          </a:prstGeom>
+                        </pic:spPr>
+                      </pic:pic>
+                    </a:graphicData>
+                  </a:graphic>
+                </wp:inline>
+              </w:drawing>
+            </w:r>
           </w:p>
         </w:tc>
       </w:tr>
@@ -217,6 +257,7 @@
                 <w:sz w:val="28"/>
                 <w:szCs w:val="28"/>
               </w:rPr>
+              <w:lastRenderedPageBreak/>
               <w:t>Julien</w:t>
             </w:r>
           </w:p>
@@ -254,6 +295,7 @@
                 <w:szCs w:val="20"/>
                 <w:lang w:val="en-GB"/>
               </w:rPr>
+              <w:lastRenderedPageBreak/>
               <w:t>FORMATION</w:t>
             </w:r>
           </w:p>
@@ -335,6 +377,7 @@
         <w:alias w:val="Sommaire"/>
         <w:id w:val="-94628373"/>
       </w:sdtPr>
+      <w:sdtEndPr/>
       <w:sdtContent>
         <w:p>
           <w:pPr>
@@ -1497,7 +1540,7 @@
                     </pic:cNvPicPr>
                   </pic:nvPicPr>
                   <pic:blipFill>
-                    <a:blip r:embed="rId7"/>
+                    <a:blip r:embed="rId8"/>
                     <a:srcRect/>
                     <a:stretch>
                       <a:fillRect/>
@@ -1560,6 +1603,9 @@
         <w:jc w:val="center"/>
       </w:pPr>
       <w:r>
+        <w:rPr>
+          <w:noProof/>
+        </w:rPr>
         <w:lastRenderedPageBreak/>
         <w:drawing>
           <wp:inline distT="0" distB="0" distL="0" distR="0" wp14:anchorId="707223B3" wp14:editId="180EF8D4">
@@ -1577,7 +1623,7 @@
                     <pic:cNvPicPr/>
                   </pic:nvPicPr>
                   <pic:blipFill>
-                    <a:blip r:embed="rId8"/>
+                    <a:blip r:embed="rId9"/>
                     <a:stretch>
                       <a:fillRect/>
                     </a:stretch>
@@ -5136,7 +5182,7 @@
                     </pic:cNvPicPr>
                   </pic:nvPicPr>
                   <pic:blipFill>
-                    <a:blip r:embed="rId9"/>
+                    <a:blip r:embed="rId10"/>
                     <a:srcRect/>
                     <a:stretch>
                       <a:fillRect/>
@@ -10316,7 +10362,7 @@
                     </pic:cNvPicPr>
                   </pic:nvPicPr>
                   <pic:blipFill>
-                    <a:blip r:embed="rId10"/>
+                    <a:blip r:embed="rId11"/>
                     <a:srcRect/>
                     <a:stretch>
                       <a:fillRect/>
@@ -10570,185 +10616,6 @@
             <wp:extent cx="5143500" cy="2466975"/>
             <wp:effectExtent l="0" t="0" r="0" b="0"/>
             <wp:docPr id="937554106" name="Figure 5" descr="Capture de la page de gestion des voitures avec le formulaire d'ajout" title="Figure 5"/>
-            <wp:cNvGraphicFramePr>
-              <a:graphicFrameLocks xmlns:a="http://schemas.openxmlformats.org/drawingml/2006/main" noChangeAspect="1"/>
-            </wp:cNvGraphicFramePr>
-            <a:graphic xmlns:a="http://schemas.openxmlformats.org/drawingml/2006/main">
-              <a:graphicData uri="http://schemas.openxmlformats.org/drawingml/2006/picture">
-                <pic:pic xmlns:pic="http://schemas.openxmlformats.org/drawingml/2006/picture">
-                  <pic:nvPicPr>
-                    <pic:cNvPr id="0" name=""/>
-                    <pic:cNvPicPr>
-                      <a:picLocks noChangeAspect="1" noChangeArrowheads="1"/>
-                    </pic:cNvPicPr>
-                  </pic:nvPicPr>
-                  <pic:blipFill>
-                    <a:blip r:embed="rId11"/>
-                    <a:srcRect/>
-                    <a:stretch>
-                      <a:fillRect/>
-                    </a:stretch>
-                  </pic:blipFill>
-                  <pic:spPr bwMode="auto">
-                    <a:xfrm>
-                      <a:off x="0" y="0"/>
-                      <a:ext cx="5143500" cy="2466975"/>
-                    </a:xfrm>
-                    <a:prstGeom prst="rect">
-                      <a:avLst/>
-                    </a:prstGeom>
-                  </pic:spPr>
-                </pic:pic>
-              </a:graphicData>
-            </a:graphic>
-          </wp:inline>
-        </w:drawing>
-      </w:r>
-    </w:p>
-    <w:p>
-      <w:pPr>
-        <w:spacing w:before="100" w:after="280"/>
-        <w:jc w:val="center"/>
-      </w:pPr>
-      <w:r>
-        <w:rPr>
-          <w:b/>
-          <w:bCs/>
-          <w:i/>
-          <w:iCs/>
-          <w:color w:val="C2410C"/>
-          <w:sz w:val="20"/>
-          <w:szCs w:val="20"/>
-        </w:rPr>
-        <w:t>Figure 5</w:t>
-      </w:r>
-      <w:r>
-        <w:rPr>
-          <w:i/>
-          <w:iCs/>
-          <w:color w:val="6B7280"/>
-          <w:sz w:val="20"/>
-          <w:szCs w:val="20"/>
-        </w:rPr>
-        <w:t xml:space="preserve"> – Gestion des voitures : formulaire d’ajout d’un véhicule</w:t>
-      </w:r>
-    </w:p>
-    <w:p>
-      <w:pPr>
-        <w:pStyle w:val="Titre3"/>
-        <w:keepNext/>
-        <w:keepLines/>
-      </w:pPr>
-      <w:bookmarkStart w:id="23" w:name="_Toc900024"/>
-      <w:r>
-        <w:lastRenderedPageBreak/>
-        <w:t>12.2 Gestion des clients</w:t>
-      </w:r>
-      <w:bookmarkEnd w:id="23"/>
-    </w:p>
-    <w:p>
-      <w:pPr>
-        <w:jc w:val="both"/>
-      </w:pPr>
-      <w:r>
-        <w:t xml:space="preserve">La gestion des clients ne dispose pas d’une page CRUD indépendante dans le back-office : elle s’appuie sur </w:t>
-      </w:r>
-      <w:proofErr w:type="spellStart"/>
-      <w:r>
-        <w:rPr>
-          <w:rFonts w:ascii="Consolas" w:eastAsia="Consolas" w:hAnsi="Consolas" w:cs="Consolas"/>
-          <w:color w:val="9A3412"/>
-          <w:sz w:val="22"/>
-          <w:szCs w:val="22"/>
-          <w:shd w:val="clear" w:color="auto" w:fill="EEF0F3"/>
-        </w:rPr>
-        <w:t>client_modele.php</w:t>
-      </w:r>
-      <w:proofErr w:type="spellEnd"/>
-      <w:r>
-        <w:t xml:space="preserve"> (admin), qui permet de consulter les informations d’un client (nom, coordonnées, etc.) directement depuis la gestion des demandes d’essai et des messages de contact, chacune de ces entités étant liée à un </w:t>
-      </w:r>
-      <w:proofErr w:type="spellStart"/>
-      <w:r>
-        <w:rPr>
-          <w:rFonts w:ascii="Consolas" w:eastAsia="Consolas" w:hAnsi="Consolas" w:cs="Consolas"/>
-          <w:color w:val="9A3412"/>
-          <w:sz w:val="22"/>
-          <w:szCs w:val="22"/>
-          <w:shd w:val="clear" w:color="auto" w:fill="EEF0F3"/>
-        </w:rPr>
-        <w:t>id_client</w:t>
-      </w:r>
-      <w:proofErr w:type="spellEnd"/>
-      <w:r>
-        <w:t>.</w:t>
-      </w:r>
-    </w:p>
-    <w:p>
-      <w:pPr>
-        <w:pStyle w:val="Titre3"/>
-        <w:keepNext/>
-        <w:keepLines/>
-      </w:pPr>
-      <w:bookmarkStart w:id="24" w:name="_Toc900025"/>
-      <w:r>
-        <w:t>12.3 Gestion des demandes d’essai</w:t>
-      </w:r>
-      <w:bookmarkEnd w:id="24"/>
-    </w:p>
-    <w:p>
-      <w:pPr>
-        <w:jc w:val="both"/>
-      </w:pPr>
-      <w:r>
-        <w:t xml:space="preserve">Le module de gestion des demandes d’essai constitue l’une des fonctionnalités centrales de la partie administration du site </w:t>
-      </w:r>
-      <w:proofErr w:type="spellStart"/>
-      <w:r>
-        <w:t>SuperCar</w:t>
-      </w:r>
-      <w:proofErr w:type="spellEnd"/>
-      <w:r>
-        <w:t>. Il permet aux administrateurs de consulter, traiter et suivre l’ensemble des demandes d’essai transmises par les clients depuis la partie publique du site.</w:t>
-      </w:r>
-    </w:p>
-    <w:p>
-      <w:pPr>
-        <w:jc w:val="both"/>
-      </w:pPr>
-      <w:r>
-        <w:t>Concrètement, cette page affiche la liste de toutes les demandes enregistrées en base de données, avec pour chacune les informations saisies par le client (identité, coordonnées, voiture souhaitée, date et créneau demandés) ainsi que son statut actuel (en attente, validée ou refusée). L’administrateur peut modifier ce statut directement depuis l’interface, ce qui met à jour l’enregistrement correspondant dans la base de données, et peut également supprimer une demande devenue obsolète.</w:t>
-      </w:r>
-    </w:p>
-    <w:p>
-      <w:pPr>
-        <w:jc w:val="both"/>
-      </w:pPr>
-      <w:r>
-        <w:t>Cette fonctionnalité a été développée en respectant l’architecture MVC mise en place lors de la refactorisation du projet : le contrôleur récupère les données via des requêtes préparées (PDO), et la vue se charge uniquement de leur affichage, sans logique métier mêlée au HTML.</w:t>
-      </w:r>
-    </w:p>
-    <w:p>
-      <w:pPr>
-        <w:keepNext/>
-        <w:pBdr>
-          <w:top w:val="single" w:sz="6" w:space="6" w:color="D1D5DB"/>
-          <w:left w:val="single" w:sz="6" w:space="6" w:color="D1D5DB"/>
-          <w:bottom w:val="single" w:sz="6" w:space="6" w:color="D1D5DB"/>
-          <w:right w:val="single" w:sz="6" w:space="6" w:color="D1D5DB"/>
-        </w:pBdr>
-        <w:spacing w:before="160" w:after="0"/>
-        <w:jc w:val="center"/>
-      </w:pPr>
-      <w:r>
-        <w:rPr>
-          <w:noProof/>
-        </w:rPr>
-        <w:drawing>
-          <wp:inline distT="0" distB="0" distL="0" distR="0" wp14:anchorId="09646380" wp14:editId="6B49CEEF">
-            <wp:extent cx="5143500" cy="2400300"/>
-            <wp:effectExtent l="0" t="0" r="0" b="0"/>
-            <wp:docPr id="954903872" name="Figure 6" descr="Capture de la page de gestion des demandes d'essai" title="Figure 6"/>
             <wp:cNvGraphicFramePr>
               <a:graphicFrameLocks xmlns:a="http://schemas.openxmlformats.org/drawingml/2006/main" noChangeAspect="1"/>
             </wp:cNvGraphicFramePr>
@@ -10771,7 +10638,7 @@
                   <pic:spPr bwMode="auto">
                     <a:xfrm>
                       <a:off x="0" y="0"/>
-                      <a:ext cx="5143500" cy="2400300"/>
+                      <a:ext cx="5143500" cy="2466975"/>
                     </a:xfrm>
                     <a:prstGeom prst="rect">
                       <a:avLst/>
@@ -10799,7 +10666,7 @@
           <w:sz w:val="20"/>
           <w:szCs w:val="20"/>
         </w:rPr>
-        <w:t>Figure 6</w:t>
+        <w:t>Figure 5</w:t>
       </w:r>
       <w:r>
         <w:rPr>
@@ -10809,7 +10676,7 @@
           <w:sz w:val="20"/>
           <w:szCs w:val="20"/>
         </w:rPr>
-        <w:t xml:space="preserve"> – Gestion des demandes d’essai</w:t>
+        <w:t xml:space="preserve"> – Gestion des voitures : formulaire d’ajout d’un véhicule</w:t>
       </w:r>
     </w:p>
     <w:p>
@@ -10818,30 +10685,93 @@
         <w:keepNext/>
         <w:keepLines/>
       </w:pPr>
-      <w:bookmarkStart w:id="25" w:name="_Toc900026"/>
-      <w:r>
-        <w:t>12.4 Gestion des messages de contact</w:t>
-      </w:r>
-      <w:bookmarkEnd w:id="25"/>
+      <w:bookmarkStart w:id="23" w:name="_Toc900024"/>
+      <w:r>
+        <w:lastRenderedPageBreak/>
+        <w:t>12.2 Gestion des clients</w:t>
+      </w:r>
+      <w:bookmarkEnd w:id="23"/>
     </w:p>
     <w:p>
       <w:pPr>
         <w:jc w:val="both"/>
       </w:pPr>
       <w:r>
-        <w:t xml:space="preserve">Le module de gestion des messages de contact permet aux administrateurs de consulter les messages envoyés par les visiteurs via le formulaire de contact présent sur la partie publique </w:t>
-      </w:r>
-      <w:r>
-        <w:lastRenderedPageBreak/>
-        <w:t>du site. Chaque message enregistré en base de données comprend les coordonnées de l’expéditeur ainsi que le contenu de sa demande.</w:t>
-      </w:r>
+        <w:t xml:space="preserve">La gestion des clients ne dispose pas d’une page CRUD indépendante dans le back-office : elle s’appuie sur </w:t>
+      </w:r>
+      <w:proofErr w:type="spellStart"/>
+      <w:r>
+        <w:rPr>
+          <w:rFonts w:ascii="Consolas" w:eastAsia="Consolas" w:hAnsi="Consolas" w:cs="Consolas"/>
+          <w:color w:val="9A3412"/>
+          <w:sz w:val="22"/>
+          <w:szCs w:val="22"/>
+          <w:shd w:val="clear" w:color="auto" w:fill="EEF0F3"/>
+        </w:rPr>
+        <w:t>client_modele.php</w:t>
+      </w:r>
+      <w:proofErr w:type="spellEnd"/>
+      <w:r>
+        <w:t xml:space="preserve"> (admin), qui permet de consulter les informations d’un client (nom, coordonnées, etc.) directement depuis la gestion des demandes d’essai et des messages de contact, chacune de ces entités étant liée à un </w:t>
+      </w:r>
+      <w:proofErr w:type="spellStart"/>
+      <w:r>
+        <w:rPr>
+          <w:rFonts w:ascii="Consolas" w:eastAsia="Consolas" w:hAnsi="Consolas" w:cs="Consolas"/>
+          <w:color w:val="9A3412"/>
+          <w:sz w:val="22"/>
+          <w:szCs w:val="22"/>
+          <w:shd w:val="clear" w:color="auto" w:fill="EEF0F3"/>
+        </w:rPr>
+        <w:t>id_client</w:t>
+      </w:r>
+      <w:proofErr w:type="spellEnd"/>
+      <w:r>
+        <w:t>.</w:t>
+      </w:r>
+    </w:p>
+    <w:p>
+      <w:pPr>
+        <w:pStyle w:val="Titre3"/>
+        <w:keepNext/>
+        <w:keepLines/>
+      </w:pPr>
+      <w:bookmarkStart w:id="24" w:name="_Toc900025"/>
+      <w:r>
+        <w:t>12.3 Gestion des demandes d’essai</w:t>
+      </w:r>
+      <w:bookmarkEnd w:id="24"/>
     </w:p>
     <w:p>
       <w:pPr>
         <w:jc w:val="both"/>
       </w:pPr>
       <w:r>
-        <w:t>L’interface d’administration liste ces messages par ordre chronologique, permet d’en afficher le détail complet et d’en supprimer un une fois qu’il a été traité par l’équipe commerciale. Comme pour les demandes d’essai, l’accès à cette page est réservé aux administrateurs authentifiés, et les échanges avec la base de données passent par des requêtes préparées afin d’éviter tout risque d’injection SQL.</w:t>
+        <w:t xml:space="preserve">Le module de gestion des demandes d’essai constitue l’une des fonctionnalités centrales de la partie administration du site </w:t>
+      </w:r>
+      <w:proofErr w:type="spellStart"/>
+      <w:r>
+        <w:t>SuperCar</w:t>
+      </w:r>
+      <w:proofErr w:type="spellEnd"/>
+      <w:r>
+        <w:t>. Il permet aux administrateurs de consulter, traiter et suivre l’ensemble des demandes d’essai transmises par les clients depuis la partie publique du site.</w:t>
+      </w:r>
+    </w:p>
+    <w:p>
+      <w:pPr>
+        <w:jc w:val="both"/>
+      </w:pPr>
+      <w:r>
+        <w:t>Concrètement, cette page affiche la liste de toutes les demandes enregistrées en base de données, avec pour chacune les informations saisies par le client (identité, coordonnées, voiture souhaitée, date et créneau demandés) ainsi que son statut actuel (en attente, validée ou refusée). L’administrateur peut modifier ce statut directement depuis l’interface, ce qui met à jour l’enregistrement correspondant dans la base de données, et peut également supprimer une demande devenue obsolète.</w:t>
+      </w:r>
+    </w:p>
+    <w:p>
+      <w:pPr>
+        <w:jc w:val="both"/>
+      </w:pPr>
+      <w:r>
+        <w:t>Cette fonctionnalité a été développée en respectant l’architecture MVC mise en place lors de la refactorisation du projet : le contrôleur récupère les données via des requêtes préparées (PDO), et la vue se charge uniquement de leur affichage, sans logique métier mêlée au HTML.</w:t>
       </w:r>
     </w:p>
     <w:p>
@@ -10861,10 +10791,10 @@
           <w:noProof/>
         </w:rPr>
         <w:drawing>
-          <wp:inline distT="0" distB="0" distL="0" distR="0" wp14:anchorId="099491D3" wp14:editId="23AB0DD1">
+          <wp:inline distT="0" distB="0" distL="0" distR="0" wp14:anchorId="09646380" wp14:editId="6B49CEEF">
             <wp:extent cx="5143500" cy="2400300"/>
             <wp:effectExtent l="0" t="0" r="0" b="0"/>
-            <wp:docPr id="1516924295" name="Figure 7" descr="Capture de la page de gestion des messages de contact" title="Figure 7"/>
+            <wp:docPr id="954903872" name="Figure 6" descr="Capture de la page de gestion des demandes d'essai" title="Figure 6"/>
             <wp:cNvGraphicFramePr>
               <a:graphicFrameLocks xmlns:a="http://schemas.openxmlformats.org/drawingml/2006/main" noChangeAspect="1"/>
             </wp:cNvGraphicFramePr>
@@ -10915,7 +10845,7 @@
           <w:sz w:val="20"/>
           <w:szCs w:val="20"/>
         </w:rPr>
-        <w:t>Figure 7</w:t>
+        <w:t>Figure 6</w:t>
       </w:r>
       <w:r>
         <w:rPr>
@@ -10925,7 +10855,7 @@
           <w:sz w:val="20"/>
           <w:szCs w:val="20"/>
         </w:rPr>
-        <w:t xml:space="preserve"> – Gestion des messages de contact</w:t>
+        <w:t xml:space="preserve"> – Gestion des demandes d’essai</w:t>
       </w:r>
     </w:p>
     <w:p>
@@ -10934,18 +10864,22 @@
         <w:keepNext/>
         <w:keepLines/>
       </w:pPr>
-      <w:bookmarkStart w:id="26" w:name="_Toc900027"/>
-      <w:r>
-        <w:t>12.5 Authentification et sécurité</w:t>
-      </w:r>
-      <w:bookmarkEnd w:id="26"/>
+      <w:bookmarkStart w:id="25" w:name="_Toc900026"/>
+      <w:r>
+        <w:t>12.4 Gestion des messages de contact</w:t>
+      </w:r>
+      <w:bookmarkEnd w:id="25"/>
     </w:p>
     <w:p>
       <w:pPr>
         <w:jc w:val="both"/>
       </w:pPr>
       <w:r>
-        <w:t>L’accès à l’ensemble du module d’administration est protégé par un système d’authentification. Une page de connexion dédiée demande à l’administrateur de saisir ses identifiants, vérifiés en base de données après hachage du mot de passe. Une fois connecté, une session PHP est ouverte et maintenue tout au long de la navigation dans l’espace d’administration.</w:t>
+        <w:t xml:space="preserve">Le module de gestion des messages de contact permet aux administrateurs de consulter les messages envoyés par les visiteurs via le formulaire de contact présent sur la partie publique </w:t>
+      </w:r>
+      <w:r>
+        <w:lastRenderedPageBreak/>
+        <w:t>du site. Chaque message enregistré en base de données comprend les coordonnées de l’expéditeur ainsi que le contenu de sa demande.</w:t>
       </w:r>
     </w:p>
     <w:p>
@@ -10953,7 +10887,7 @@
         <w:jc w:val="both"/>
       </w:pPr>
       <w:r>
-        <w:t>Chaque page de l’administration vérifie, avant tout affichage, qu’une session valide est active ; en l’absence de session, l’utilisateur est automatiquement redirigé vers la page de connexion. Ce contrôle a été centralisé lors de la refactorisation du projet vers une architecture MVC sécurisée, afin d’éviter de dupliquer la vérification sur chaque page et de garantir qu’aucune route d’administration ne reste accessible sans authentification. Un bouton de déconnexion permet enfin de détruire proprement la session en cours.</w:t>
+        <w:t>L’interface d’administration liste ces messages par ordre chronologique, permet d’en afficher le détail complet et d’en supprimer un une fois qu’il a été traité par l’équipe commerciale. Comme pour les demandes d’essai, l’accès à cette page est réservé aux administrateurs authentifiés, et les échanges avec la base de données passent par des requêtes préparées afin d’éviter tout risque d’injection SQL.</w:t>
       </w:r>
     </w:p>
     <w:p>
@@ -10972,12 +10906,11 @@
         <w:rPr>
           <w:noProof/>
         </w:rPr>
-        <w:lastRenderedPageBreak/>
         <w:drawing>
-          <wp:inline distT="0" distB="0" distL="0" distR="0" wp14:anchorId="743DCD4F" wp14:editId="01FA4D5C">
+          <wp:inline distT="0" distB="0" distL="0" distR="0" wp14:anchorId="099491D3" wp14:editId="23AB0DD1">
             <wp:extent cx="5143500" cy="2400300"/>
             <wp:effectExtent l="0" t="0" r="0" b="0"/>
-            <wp:docPr id="298175138" name="Figure 8" descr="Capture de la page de connexion de l'administration" title="Figure 8"/>
+            <wp:docPr id="1516924295" name="Figure 7" descr="Capture de la page de gestion des messages de contact" title="Figure 7"/>
             <wp:cNvGraphicFramePr>
               <a:graphicFrameLocks xmlns:a="http://schemas.openxmlformats.org/drawingml/2006/main" noChangeAspect="1"/>
             </wp:cNvGraphicFramePr>
@@ -11028,7 +10961,7 @@
           <w:sz w:val="20"/>
           <w:szCs w:val="20"/>
         </w:rPr>
-        <w:t>Figure 8</w:t>
+        <w:t>Figure 7</w:t>
       </w:r>
       <w:r>
         <w:rPr>
@@ -11038,20 +10971,8 @@
           <w:sz w:val="20"/>
           <w:szCs w:val="20"/>
         </w:rPr>
-        <w:t xml:space="preserve"> – Page de connexion de l’administration</w:t>
-      </w:r>
-    </w:p>
-    <w:p>
-      <w:pPr>
-        <w:pStyle w:val="Titre2"/>
-        <w:keepNext/>
-        <w:keepLines/>
-      </w:pPr>
-      <w:bookmarkStart w:id="27" w:name="_Toc900028"/>
-      <w:r>
-        <w:t>13. Fonctionnalités spécifiques</w:t>
-      </w:r>
-      <w:bookmarkEnd w:id="27"/>
+        <w:t xml:space="preserve"> – Gestion des messages de contact</w:t>
+      </w:r>
     </w:p>
     <w:p>
       <w:pPr>
@@ -11059,26 +10980,18 @@
         <w:keepNext/>
         <w:keepLines/>
       </w:pPr>
-      <w:bookmarkStart w:id="28" w:name="_Toc900029"/>
-      <w:r>
-        <w:t>13.1 Sélecteur de carte (Leaflet.js)</w:t>
-      </w:r>
-      <w:bookmarkEnd w:id="28"/>
+      <w:bookmarkStart w:id="26" w:name="_Toc900027"/>
+      <w:r>
+        <w:t>12.5 Authentification et sécurité</w:t>
+      </w:r>
+      <w:bookmarkEnd w:id="26"/>
     </w:p>
     <w:p>
       <w:pPr>
         <w:jc w:val="both"/>
       </w:pPr>
       <w:r>
-        <w:t xml:space="preserve">Afin d’enrichir l’expérience utilisateur, le projet intègre la bibliothèque JavaScript Leaflet.js, couplée à des fonds de carte </w:t>
-      </w:r>
-      <w:proofErr w:type="spellStart"/>
-      <w:r>
-        <w:t>OpenStreetMap</w:t>
-      </w:r>
-      <w:proofErr w:type="spellEnd"/>
-      <w:r>
-        <w:t>, pour proposer un sélecteur de carte interactif. Cet outil permet de visualiser et de sélectionner une localisation directement sur une carte, sans dépendre d’un service cartographique payant.</w:t>
+        <w:t>L’accès à l’ensemble du module d’administration est protégé par un système d’authentification. Une page de connexion dédiée demande à l’administrateur de saisir ses identifiants, vérifiés en base de données après hachage du mot de passe. Une fois connecté, une session PHP est ouverte et maintenue tout au long de la navigation dans l’espace d’administration.</w:t>
       </w:r>
     </w:p>
     <w:p>
@@ -11086,69 +10999,10 @@
         <w:jc w:val="both"/>
       </w:pPr>
       <w:r>
-        <w:t>L’intégration de Leaflet.js a nécessité de charger la bibliothèque et sa feuille de style, d’initialiser la carte sur des coordonnées par défaut, puis de gérer les événements de clic ou de sélection pour récupérer la latitude et la longitude choisies et les transmettre au formulaire correspondant. Ce composant illustre la capacité du projet à intégrer des bibliothèques tierces pour répondre à des besoins fonctionnels précis, au-delà des seules interactions PHP/MySQL classiques.</w:t>
-      </w:r>
-    </w:p>
-    <w:p>
-      <w:pPr>
-        <w:pStyle w:val="Titre3"/>
-        <w:keepNext/>
-        <w:keepLines/>
-      </w:pPr>
-      <w:bookmarkStart w:id="29" w:name="_Toc900030"/>
-      <w:r>
-        <w:t>13.2 Navigation latérale partagée (sidebar)</w:t>
-      </w:r>
-      <w:bookmarkEnd w:id="29"/>
-    </w:p>
-    <w:p>
-      <w:pPr>
-        <w:jc w:val="both"/>
-      </w:pPr>
-      <w:r>
-        <w:t>Toutes les pages de l’administration partagent une même barre de navigation latérale (sidebar), regroupant les liens vers les différentes sections : gestion des voitures, gestion des clients, demandes d’essai, messages de contact, ainsi que le bouton de déconnexion. Le lien correspondant à la page actuellement affichée est mis en évidence, ce qui facilite le repérage de l’administrateur dans l’interface.</w:t>
-      </w:r>
-    </w:p>
-    <w:p>
-      <w:pPr>
-        <w:jc w:val="both"/>
-      </w:pPr>
-      <w:r>
-        <w:t xml:space="preserve">Sur le plan technique, cette sidebar a été isolée dans un fichier PHP unique (inclus via </w:t>
-      </w:r>
-      <w:proofErr w:type="spellStart"/>
-      <w:r>
-        <w:rPr>
-          <w:rFonts w:ascii="Consolas" w:eastAsia="Consolas" w:hAnsi="Consolas" w:cs="Consolas"/>
-          <w:color w:val="9A3412"/>
-          <w:sz w:val="22"/>
-          <w:szCs w:val="22"/>
-          <w:shd w:val="clear" w:color="auto" w:fill="EEF0F3"/>
-        </w:rPr>
-        <w:t>include</w:t>
-      </w:r>
-      <w:proofErr w:type="spellEnd"/>
-      <w:r>
-        <w:t xml:space="preserve"> ou </w:t>
-      </w:r>
-      <w:proofErr w:type="spellStart"/>
-      <w:r>
-        <w:rPr>
-          <w:rFonts w:ascii="Consolas" w:eastAsia="Consolas" w:hAnsi="Consolas" w:cs="Consolas"/>
-          <w:color w:val="9A3412"/>
-          <w:sz w:val="22"/>
-          <w:szCs w:val="22"/>
-          <w:shd w:val="clear" w:color="auto" w:fill="EEF0F3"/>
-        </w:rPr>
-        <w:t>require</w:t>
-      </w:r>
-      <w:proofErr w:type="spellEnd"/>
-      <w:r>
-        <w:t xml:space="preserve"> dans chaque page d’administration), dans la continuité du travail de modularisation et de refactorisation MVC mené sur le projet. Cette approche évite la duplication de code HTML entre les pages, simplifie la maintenance — toute modification de </w:t>
-      </w:r>
-      <w:r>
-        <w:lastRenderedPageBreak/>
-        <w:t>la navigation ne se fait qu’à un seul endroit — et garantit une cohérence visuelle sur l’ensemble du module d’administration.</w:t>
+        <w:t>Chaque page de l’administration vérifie, avant tout affichage, qu’une session valide est active ; en l’absence de session, l’utilisateur est automatiquement redirigé vers la page de connexion. Ce contrôle a été centralisé lors de la refactorisation du projet vers une architecture MVC sécurisée, afin d’éviter de dupliquer la vérification sur chaque page et de garantir qu’aucune route d’administration ne reste accessible sans authentification. Un bouton de déconnexion permet enfin de détruire proprement la se</w:t>
+      </w:r>
+      <w:r>
+        <w:t>ssion en cours.</w:t>
       </w:r>
     </w:p>
     <w:p>
@@ -11161,18 +11015,18 @@
           <w:right w:val="single" w:sz="6" w:space="6" w:color="D1D5DB"/>
         </w:pBdr>
         <w:spacing w:before="160" w:after="0"/>
-        <w:ind w:left="2900" w:right="2900"/>
         <w:jc w:val="center"/>
       </w:pPr>
       <w:r>
         <w:rPr>
           <w:noProof/>
         </w:rPr>
+        <w:lastRenderedPageBreak/>
         <w:drawing>
-          <wp:inline distT="0" distB="0" distL="0" distR="0" wp14:anchorId="7A76670F" wp14:editId="2B5CA3D6">
-            <wp:extent cx="1905000" cy="3695700"/>
+          <wp:inline distT="0" distB="0" distL="0" distR="0" wp14:anchorId="743DCD4F" wp14:editId="01FA4D5C">
+            <wp:extent cx="5143500" cy="2400300"/>
             <wp:effectExtent l="0" t="0" r="0" b="0"/>
-            <wp:docPr id="1455516538" name="Figure 9" descr="Capture de la barre de navigation latérale de l'administration" title="Figure 9"/>
+            <wp:docPr id="298175138" name="Figure 8" descr="Capture de la page de connexion de l'administration" title="Figure 8"/>
             <wp:cNvGraphicFramePr>
               <a:graphicFrameLocks xmlns:a="http://schemas.openxmlformats.org/drawingml/2006/main" noChangeAspect="1"/>
             </wp:cNvGraphicFramePr>
@@ -11195,6 +11049,201 @@
                   <pic:spPr bwMode="auto">
                     <a:xfrm>
                       <a:off x="0" y="0"/>
+                      <a:ext cx="5143500" cy="2400300"/>
+                    </a:xfrm>
+                    <a:prstGeom prst="rect">
+                      <a:avLst/>
+                    </a:prstGeom>
+                  </pic:spPr>
+                </pic:pic>
+              </a:graphicData>
+            </a:graphic>
+          </wp:inline>
+        </w:drawing>
+      </w:r>
+    </w:p>
+    <w:p>
+      <w:pPr>
+        <w:spacing w:before="100" w:after="280"/>
+        <w:jc w:val="center"/>
+      </w:pPr>
+      <w:r>
+        <w:rPr>
+          <w:b/>
+          <w:bCs/>
+          <w:i/>
+          <w:iCs/>
+          <w:color w:val="C2410C"/>
+          <w:sz w:val="20"/>
+          <w:szCs w:val="20"/>
+        </w:rPr>
+        <w:t>Figure 8</w:t>
+      </w:r>
+      <w:r>
+        <w:rPr>
+          <w:i/>
+          <w:iCs/>
+          <w:color w:val="6B7280"/>
+          <w:sz w:val="20"/>
+          <w:szCs w:val="20"/>
+        </w:rPr>
+        <w:t xml:space="preserve"> – Page de connexion de l’administration</w:t>
+      </w:r>
+    </w:p>
+    <w:p>
+      <w:pPr>
+        <w:pStyle w:val="Titre2"/>
+        <w:keepNext/>
+        <w:keepLines/>
+      </w:pPr>
+      <w:bookmarkStart w:id="27" w:name="_Toc900028"/>
+      <w:r>
+        <w:t>13. Fonctionnalités spécifiques</w:t>
+      </w:r>
+      <w:bookmarkEnd w:id="27"/>
+    </w:p>
+    <w:p>
+      <w:pPr>
+        <w:pStyle w:val="Titre3"/>
+        <w:keepNext/>
+        <w:keepLines/>
+      </w:pPr>
+      <w:bookmarkStart w:id="28" w:name="_Toc900029"/>
+      <w:r>
+        <w:t>13.1 Sélecteur de carte (Leaflet.js)</w:t>
+      </w:r>
+      <w:bookmarkEnd w:id="28"/>
+    </w:p>
+    <w:p>
+      <w:pPr>
+        <w:jc w:val="both"/>
+      </w:pPr>
+      <w:r>
+        <w:t xml:space="preserve">Afin d’enrichir l’expérience utilisateur, le projet intègre la bibliothèque JavaScript Leaflet.js, couplée à des fonds de carte </w:t>
+      </w:r>
+      <w:proofErr w:type="spellStart"/>
+      <w:r>
+        <w:t>OpenStreetMap</w:t>
+      </w:r>
+      <w:proofErr w:type="spellEnd"/>
+      <w:r>
+        <w:t>, pour proposer un sélecteur de carte interactif. Cet outil permet de visualiser et de sélectionner une localisation directement sur une carte, sans dépendre d’un service cartographique payant.</w:t>
+      </w:r>
+    </w:p>
+    <w:p>
+      <w:pPr>
+        <w:jc w:val="both"/>
+      </w:pPr>
+      <w:r>
+        <w:t>L’intégration de Leaflet.js a nécessité de charger la bibliothèque et sa feuille de style, d’initialiser la carte sur des coordonnées par défaut, puis de gérer les événements de clic ou de sélection pour récupérer la latitude et la longitude choisies et les transmettre au formulaire correspondant. Ce composant illustre la capacité du projet à intégrer des bibliothèques tierces pour répondre à des besoins fonctionnels précis, au-delà des seules interactions PHP/MySQL classiques.</w:t>
+      </w:r>
+    </w:p>
+    <w:p>
+      <w:pPr>
+        <w:pStyle w:val="Titre3"/>
+        <w:keepNext/>
+        <w:keepLines/>
+      </w:pPr>
+      <w:bookmarkStart w:id="29" w:name="_Toc900030"/>
+      <w:r>
+        <w:t>13.2 Navigation latérale partagée (sidebar)</w:t>
+      </w:r>
+      <w:bookmarkEnd w:id="29"/>
+    </w:p>
+    <w:p>
+      <w:pPr>
+        <w:jc w:val="both"/>
+      </w:pPr>
+      <w:r>
+        <w:t>Toutes les pages de l’administration partagent une même barre de navigation latérale (sidebar), regroupant les liens vers les différentes sections : gestion des voitures, gestion des clients, demandes d’essai, messages de contact, ainsi que le bouton de déconnexion. Le lien correspondant à la page actuellement affichée est mis en évidence, ce qui facilite le repérage de l’administrateur dans l’interface.</w:t>
+      </w:r>
+    </w:p>
+    <w:p>
+      <w:pPr>
+        <w:jc w:val="both"/>
+      </w:pPr>
+      <w:r>
+        <w:t xml:space="preserve">Sur le plan technique, cette sidebar a été isolée dans un fichier PHP unique (inclus via </w:t>
+      </w:r>
+      <w:proofErr w:type="spellStart"/>
+      <w:r>
+        <w:rPr>
+          <w:rFonts w:ascii="Consolas" w:eastAsia="Consolas" w:hAnsi="Consolas" w:cs="Consolas"/>
+          <w:color w:val="9A3412"/>
+          <w:sz w:val="22"/>
+          <w:szCs w:val="22"/>
+          <w:shd w:val="clear" w:color="auto" w:fill="EEF0F3"/>
+        </w:rPr>
+        <w:t>include</w:t>
+      </w:r>
+      <w:proofErr w:type="spellEnd"/>
+      <w:r>
+        <w:t xml:space="preserve"> ou </w:t>
+      </w:r>
+      <w:proofErr w:type="spellStart"/>
+      <w:r>
+        <w:rPr>
+          <w:rFonts w:ascii="Consolas" w:eastAsia="Consolas" w:hAnsi="Consolas" w:cs="Consolas"/>
+          <w:color w:val="9A3412"/>
+          <w:sz w:val="22"/>
+          <w:szCs w:val="22"/>
+          <w:shd w:val="clear" w:color="auto" w:fill="EEF0F3"/>
+        </w:rPr>
+        <w:t>require</w:t>
+      </w:r>
+      <w:proofErr w:type="spellEnd"/>
+      <w:r>
+        <w:t xml:space="preserve"> dans chaque page d’administration), dans la continuité du travail de modularisation et de refactorisation MVC mené sur le projet. Cette approche évite la duplication de code HTML entre les pages, simplifie la maintenance — toute modification de </w:t>
+      </w:r>
+      <w:r>
+        <w:lastRenderedPageBreak/>
+        <w:t>la navigation ne se fait qu’à un seul endroit — et garantit une cohérence visuelle sur l’ensemble du module d’administration.</w:t>
+      </w:r>
+    </w:p>
+    <w:p>
+      <w:pPr>
+        <w:keepNext/>
+        <w:pBdr>
+          <w:top w:val="single" w:sz="6" w:space="6" w:color="D1D5DB"/>
+          <w:left w:val="single" w:sz="6" w:space="6" w:color="D1D5DB"/>
+          <w:bottom w:val="single" w:sz="6" w:space="6" w:color="D1D5DB"/>
+          <w:right w:val="single" w:sz="6" w:space="6" w:color="D1D5DB"/>
+        </w:pBdr>
+        <w:spacing w:before="160" w:after="0"/>
+        <w:ind w:left="2900" w:right="2900"/>
+        <w:jc w:val="center"/>
+      </w:pPr>
+      <w:r>
+        <w:rPr>
+          <w:noProof/>
+        </w:rPr>
+        <w:drawing>
+          <wp:inline distT="0" distB="0" distL="0" distR="0" wp14:anchorId="7A76670F" wp14:editId="2B5CA3D6">
+            <wp:extent cx="1905000" cy="3695700"/>
+            <wp:effectExtent l="0" t="0" r="0" b="0"/>
+            <wp:docPr id="1455516538" name="Figure 9" descr="Capture de la barre de navigation latérale de l'administration" title="Figure 9"/>
+            <wp:cNvGraphicFramePr>
+              <a:graphicFrameLocks xmlns:a="http://schemas.openxmlformats.org/drawingml/2006/main" noChangeAspect="1"/>
+            </wp:cNvGraphicFramePr>
+            <a:graphic xmlns:a="http://schemas.openxmlformats.org/drawingml/2006/main">
+              <a:graphicData uri="http://schemas.openxmlformats.org/drawingml/2006/picture">
+                <pic:pic xmlns:pic="http://schemas.openxmlformats.org/drawingml/2006/picture">
+                  <pic:nvPicPr>
+                    <pic:cNvPr id="0" name=""/>
+                    <pic:cNvPicPr>
+                      <a:picLocks noChangeAspect="1" noChangeArrowheads="1"/>
+                    </pic:cNvPicPr>
+                  </pic:nvPicPr>
+                  <pic:blipFill>
+                    <a:blip r:embed="rId16"/>
+                    <a:srcRect/>
+                    <a:stretch>
+                      <a:fillRect/>
+                    </a:stretch>
+                  </pic:blipFill>
+                  <pic:spPr bwMode="auto">
+                    <a:xfrm>
+                      <a:off x="0" y="0"/>
                       <a:ext cx="1905000" cy="3695700"/>
                     </a:xfrm>
                     <a:prstGeom prst="rect">
@@ -11261,7 +11310,10 @@
         <w:jc w:val="both"/>
       </w:pPr>
       <w:r>
-        <w:t>La mise en place de cette charte graphique a représenté un travail progressif. Plusieurs feuilles de style CSS avaient été créées au fur et à mesure du développement, ce qui a entraîné certaines incohérences au niveau des couleurs, des espacements, de la typographie et de la mise en forme des différents éléments. Un travail de réorganisation et d’harmonisation a donc été commencé afin de regrouper les styles, de limiter les redondances et d’obtenir une apparence plus cohérente sur l’ensemble des pages d’administration. Cependant, certaines incohérences restent encore présentes et devront être corrigées lors des prochaines étapes du développement.</w:t>
+        <w:t>La mise en place de cette charte graphique a représenté un travail progressif. Plusieurs feuilles de style CSS avaient été créées au fur et à mesure du développement, ce qui a entraîné certaines incohérences au niveau des couleurs, des espacements, de la typographie et de la mise en forme des différents éléments. Un travail de réorganisation et d’harmonisation a donc été commencé afin de regrouper les styles, de limiter les redondances et d’obtenir une apparence plus cohérente sur l’ensemble des pages d’adm</w:t>
+      </w:r>
+      <w:r>
+        <w:t>inistration. Cependant, certaines incohérences restent encore présentes et devront être corrigées lors des prochaines étapes du développement.</w:t>
       </w:r>
     </w:p>
     <w:p>
@@ -12430,7 +12482,7 @@
                     <pic:cNvPicPr/>
                   </pic:nvPicPr>
                   <pic:blipFill>
-                    <a:blip r:embed="rId16"/>
+                    <a:blip r:embed="rId17"/>
                     <a:stretch>
                       <a:fillRect/>
                     </a:stretch>
@@ -12538,8 +12590,8 @@
       </w:r>
     </w:p>
     <w:sectPr>
-      <w:headerReference w:type="default" r:id="rId17"/>
-      <w:footerReference w:type="default" r:id="rId18"/>
+      <w:headerReference w:type="default" r:id="rId18"/>
+      <w:footerReference w:type="default" r:id="rId19"/>
       <w:pgSz w:w="11906" w:h="16838"/>
       <w:pgMar w:top="1440" w:right="1440" w:bottom="1440" w:left="1440" w:header="708" w:footer="708" w:gutter="0"/>
       <w:cols w:space="720"/>
@@ -13666,6 +13718,7 @@
   <w:style w:type="character" w:default="1" w:styleId="Policepardfaut">
     <w:name w:val="Default Paragraph Font"/>
     <w:uiPriority w:val="1"/>
+    <w:semiHidden/>
     <w:unhideWhenUsed/>
   </w:style>
   <w:style w:type="table" w:default="1" w:styleId="TableauNormal">

</xml_diff>